<commit_message>
1 and 2 lr uiabd eaten, rkis 2lr fuck eat me
</commit_message>
<xml_diff>
--- a/sis/Алимбеков дкип-481 лр4.docx
+++ b/sis/Алимбеков дкип-481 лр4.docx
@@ -2420,7 +2420,45 @@
           <w:sz w:val="28"/>
           <w:szCs w:val="28"/>
         </w:rPr>
-        <w:t xml:space="preserve"> (https://www.cgsecurity.org/).</w:t>
+        <w:t xml:space="preserve"> (</w:t>
+      </w:r>
+      <w:hyperlink r:id="rId6" w:history="1">
+        <w:r>
+          <w:rPr>
+            <w:rStyle w:val="a6"/>
+            <w:rFonts w:ascii="Times New Roman" w:hAnsi="Times New Roman" w:cs="Times New Roman"/>
+            <w:sz w:val="28"/>
+            <w:szCs w:val="28"/>
+          </w:rPr>
+          <w:t>https://www.cgse</w:t>
+        </w:r>
+        <w:r>
+          <w:rPr>
+            <w:rStyle w:val="a6"/>
+            <w:rFonts w:ascii="Times New Roman" w:hAnsi="Times New Roman" w:cs="Times New Roman"/>
+            <w:sz w:val="28"/>
+            <w:szCs w:val="28"/>
+          </w:rPr>
+          <w:t>c</w:t>
+        </w:r>
+        <w:r>
+          <w:rPr>
+            <w:rStyle w:val="a6"/>
+            <w:rFonts w:ascii="Times New Roman" w:hAnsi="Times New Roman" w:cs="Times New Roman"/>
+            <w:sz w:val="28"/>
+            <w:szCs w:val="28"/>
+          </w:rPr>
+          <w:t>urity.org/</w:t>
+        </w:r>
+      </w:hyperlink>
+      <w:r>
+        <w:rPr>
+          <w:rFonts w:ascii="Times New Roman" w:hAnsi="Times New Roman" w:cs="Times New Roman"/>
+          <w:color w:val="0D0D0D" w:themeColor="text1" w:themeTint="F2"/>
+          <w:sz w:val="28"/>
+          <w:szCs w:val="28"/>
+        </w:rPr>
+        <w:t>).</w:t>
       </w:r>
     </w:p>
     <w:p>
@@ -2508,7 +2546,7 @@
         <w:tabs>
           <w:tab w:val="left" w:pos="993"/>
         </w:tabs>
-        <w:spacing w:line="360" w:lineRule="auto"/>
+        <w:spacing w:after="0" w:line="360" w:lineRule="auto"/>
         <w:ind w:firstLine="709"/>
         <w:contextualSpacing/>
         <w:jc w:val="both"/>
@@ -4733,6 +4771,30 @@
       <w:szCs w:val="24"/>
     </w:rPr>
   </w:style>
+  <w:style w:type="character" w:styleId="a8">
+    <w:name w:val="Unresolved Mention"/>
+    <w:basedOn w:val="a0"/>
+    <w:uiPriority w:val="99"/>
+    <w:semiHidden/>
+    <w:unhideWhenUsed/>
+    <w:rsid w:val="002121A9"/>
+    <w:rPr>
+      <w:color w:val="605E5C"/>
+      <w:shd w:val="clear" w:color="auto" w:fill="E1DFDD"/>
+    </w:rPr>
+  </w:style>
+  <w:style w:type="character" w:styleId="a9">
+    <w:name w:val="FollowedHyperlink"/>
+    <w:basedOn w:val="a0"/>
+    <w:uiPriority w:val="99"/>
+    <w:semiHidden/>
+    <w:unhideWhenUsed/>
+    <w:rsid w:val="002121A9"/>
+    <w:rPr>
+      <w:color w:val="954F72" w:themeColor="followedHyperlink"/>
+      <w:u w:val="single"/>
+    </w:rPr>
+  </w:style>
 </w:styles>
 </file>
 

</xml_diff>